<commit_message>
docs: rework tutorial for beginners — UI-first walkthrough
Restructured from developer setup guide to a browser-driven guide:
start the app, set location, configure PV + battery, build the
generator fleet, then run and interpret the optimization results.
Jargon translated to plain language throughout.
</commit_message>
<xml_diff>
--- a/docs/TUTORIAL.docx
+++ b/docs/TUTORIAL.docx
@@ -7,12 +7,12 @@
         <w:pStyle w:val="Heading1"/>
       </w:pPr>
       <w:r>
-        <w:t>Solara Optima Platform — Step-by-Step Tutorial</w:t>
+        <w:t>Solara Optima Platform — Beginner's Tutorial</w:t>
       </w:r>
     </w:p>
     <w:p>
       <w:r>
-        <w:t>A complete walkthrough: from a fresh machine to a running platform with real optimization results. Every step includes the expected output so you can verify you are on track.</w:t>
+        <w:t>This guide walks you through the web app from the moment you start it until you get your first optimization result. No programming knowledge needed — every step happens in the browser, and each step tells you what you should see before moving on.</w:t>
       </w:r>
     </w:p>
     <w:p>
@@ -20,66 +20,10 @@
         <w:rPr>
           <w:b/>
         </w:rPr>
-        <w:t>What you will end up with</w:t>
-      </w:r>
-    </w:p>
-    <w:p>
-      <w:pPr>
-        <w:pStyle w:val="ListBullet"/>
-      </w:pPr>
-      <w:r>
-        <w:t xml:space="preserve">A FastAPI backend on </w:t>
+        <w:t xml:space="preserve">What the app does, in plain words: </w:t>
       </w:r>
       <w:r>
-        <w:rPr>
-          <w:rFonts w:ascii="Consolas" w:hAnsi="Consolas"/>
-          <w:sz w:val="20"/>
-        </w:rPr>
-        <w:t>http://localhost:8000</w:t>
-      </w:r>
-      <w:r>
-        <w:t xml:space="preserve"> (interactive API docs at </w:t>
-      </w:r>
-      <w:r>
-        <w:rPr>
-          <w:rFonts w:ascii="Consolas" w:hAnsi="Consolas"/>
-          <w:sz w:val="20"/>
-        </w:rPr>
-        <w:t>/docs</w:t>
-      </w:r>
-      <w:r>
-        <w:t>)</w:t>
-      </w:r>
-    </w:p>
-    <w:p>
-      <w:pPr>
-        <w:pStyle w:val="ListBullet"/>
-      </w:pPr>
-      <w:r>
-        <w:t xml:space="preserve">A React dashboard on </w:t>
-      </w:r>
-      <w:r>
-        <w:rPr>
-          <w:rFonts w:ascii="Consolas" w:hAnsi="Consolas"/>
-          <w:sz w:val="20"/>
-        </w:rPr>
-        <w:t>http://localhost:3000</w:t>
-      </w:r>
-    </w:p>
-    <w:p>
-      <w:pPr>
-        <w:pStyle w:val="ListBullet"/>
-      </w:pPr>
-      <w:r>
-        <w:t>A solved Unit Commitment / Economic Dispatch optimization with solar + battery</w:t>
-      </w:r>
-    </w:p>
-    <w:p>
-      <w:pPr>
-        <w:pStyle w:val="ListBullet"/>
-      </w:pPr>
-      <w:r>
-        <w:t>A marketplace estimate for a rooftop solar system (Indonesian market, IDR)</w:t>
+        <w:t>you describe a small power system — solar panels, a battery, and one or more fuel generators — plus how much electricity you need each hour of the day. The app then calculates the cheapest way to run everything: when to use solar, when to charge or discharge the battery, and when to turn generators on or off.</w:t>
       </w:r>
     </w:p>
     <w:p>
@@ -87,230 +31,7 @@
         <w:pStyle w:val="Heading2"/>
       </w:pPr>
       <w:r>
-        <w:t>1. Prerequisites</w:t>
-      </w:r>
-    </w:p>
-    <w:tbl>
-      <w:tblPr>
-        <w:tblStyle w:val="LightGrid-Accent1"/>
-        <w:tblW w:type="auto" w:w="0"/>
-        <w:tblLook w:firstColumn="1" w:firstRow="1" w:lastColumn="0" w:lastRow="0" w:noHBand="0" w:noVBand="1" w:val="04A0"/>
-      </w:tblPr>
-      <w:tblGrid>
-        <w:gridCol w:w="2880"/>
-        <w:gridCol w:w="2880"/>
-        <w:gridCol w:w="2880"/>
-      </w:tblGrid>
-      <w:tr>
-        <w:tc>
-          <w:tcPr>
-            <w:tcW w:type="dxa" w:w="2880"/>
-          </w:tcPr>
-          <w:p>
-            <w:r>
-              <w:rPr>
-                <w:b/>
-              </w:rPr>
-              <w:t>Requirement</w:t>
-            </w:r>
-          </w:p>
-        </w:tc>
-        <w:tc>
-          <w:tcPr>
-            <w:tcW w:type="dxa" w:w="2880"/>
-          </w:tcPr>
-          <w:p>
-            <w:r>
-              <w:rPr>
-                <w:b/>
-              </w:rPr>
-              <w:t>Minimum version</w:t>
-            </w:r>
-          </w:p>
-        </w:tc>
-        <w:tc>
-          <w:tcPr>
-            <w:tcW w:type="dxa" w:w="2880"/>
-          </w:tcPr>
-          <w:p>
-            <w:r>
-              <w:rPr>
-                <w:b/>
-              </w:rPr>
-              <w:t>Check with</w:t>
-            </w:r>
-          </w:p>
-        </w:tc>
-      </w:tr>
-      <w:tr>
-        <w:tc>
-          <w:tcPr>
-            <w:tcW w:type="dxa" w:w="2880"/>
-          </w:tcPr>
-          <w:p>
-            <w:r>
-              <w:rPr>
-                <w:sz w:val="20"/>
-              </w:rPr>
-              <w:t>Git</w:t>
-            </w:r>
-          </w:p>
-        </w:tc>
-        <w:tc>
-          <w:tcPr>
-            <w:tcW w:type="dxa" w:w="2880"/>
-          </w:tcPr>
-          <w:p>
-            <w:r>
-              <w:rPr>
-                <w:sz w:val="20"/>
-              </w:rPr>
-              <w:t>any recent</w:t>
-            </w:r>
-          </w:p>
-        </w:tc>
-        <w:tc>
-          <w:tcPr>
-            <w:tcW w:type="dxa" w:w="2880"/>
-          </w:tcPr>
-          <w:p>
-            <w:r>
-              <w:rPr>
-                <w:sz w:val="20"/>
-              </w:rPr>
-              <w:t>git --version</w:t>
-            </w:r>
-          </w:p>
-        </w:tc>
-      </w:tr>
-      <w:tr>
-        <w:tc>
-          <w:tcPr>
-            <w:tcW w:type="dxa" w:w="2880"/>
-          </w:tcPr>
-          <w:p>
-            <w:r>
-              <w:rPr>
-                <w:sz w:val="20"/>
-              </w:rPr>
-              <w:t>Python</w:t>
-            </w:r>
-          </w:p>
-        </w:tc>
-        <w:tc>
-          <w:tcPr>
-            <w:tcW w:type="dxa" w:w="2880"/>
-          </w:tcPr>
-          <w:p>
-            <w:r>
-              <w:rPr>
-                <w:sz w:val="20"/>
-              </w:rPr>
-              <w:t>3.12+</w:t>
-            </w:r>
-          </w:p>
-        </w:tc>
-        <w:tc>
-          <w:tcPr>
-            <w:tcW w:type="dxa" w:w="2880"/>
-          </w:tcPr>
-          <w:p>
-            <w:r>
-              <w:rPr>
-                <w:sz w:val="20"/>
-              </w:rPr>
-              <w:t>python3 --version</w:t>
-            </w:r>
-          </w:p>
-        </w:tc>
-      </w:tr>
-      <w:tr>
-        <w:tc>
-          <w:tcPr>
-            <w:tcW w:type="dxa" w:w="2880"/>
-          </w:tcPr>
-          <w:p>
-            <w:r>
-              <w:rPr>
-                <w:sz w:val="20"/>
-              </w:rPr>
-              <w:t>Node.js</w:t>
-            </w:r>
-          </w:p>
-        </w:tc>
-        <w:tc>
-          <w:tcPr>
-            <w:tcW w:type="dxa" w:w="2880"/>
-          </w:tcPr>
-          <w:p>
-            <w:r>
-              <w:rPr>
-                <w:sz w:val="20"/>
-              </w:rPr>
-              <w:t>20+</w:t>
-            </w:r>
-          </w:p>
-        </w:tc>
-        <w:tc>
-          <w:tcPr>
-            <w:tcW w:type="dxa" w:w="2880"/>
-          </w:tcPr>
-          <w:p>
-            <w:r>
-              <w:rPr>
-                <w:sz w:val="20"/>
-              </w:rPr>
-              <w:t>node --version</w:t>
-            </w:r>
-          </w:p>
-        </w:tc>
-      </w:tr>
-      <w:tr>
-        <w:tc>
-          <w:tcPr>
-            <w:tcW w:type="dxa" w:w="2880"/>
-          </w:tcPr>
-          <w:p>
-            <w:r>
-              <w:rPr>
-                <w:sz w:val="20"/>
-              </w:rPr>
-              <w:t>npm</w:t>
-            </w:r>
-          </w:p>
-        </w:tc>
-        <w:tc>
-          <w:tcPr>
-            <w:tcW w:type="dxa" w:w="2880"/>
-          </w:tcPr>
-          <w:p>
-            <w:r>
-              <w:rPr>
-                <w:sz w:val="20"/>
-              </w:rPr>
-              <w:t>9+</w:t>
-            </w:r>
-          </w:p>
-        </w:tc>
-        <w:tc>
-          <w:tcPr>
-            <w:tcW w:type="dxa" w:w="2880"/>
-          </w:tcPr>
-          <w:p>
-            <w:r>
-              <w:rPr>
-                <w:sz w:val="20"/>
-              </w:rPr>
-              <w:t>npm --version</w:t>
-            </w:r>
-          </w:p>
-        </w:tc>
-      </w:tr>
-    </w:tbl>
-    <w:p/>
-    <w:p>
-      <w:r>
-        <w:t>About 2 GB of free disk space is needed for dependencies.</w:t>
+        <w:t>1. Start the web app</w:t>
       </w:r>
     </w:p>
     <w:p>
@@ -319,118 +40,7 @@
         <w:ind w:left="240"/>
       </w:pPr>
       <w:r>
-        <w:rPr>
-          <w:b/>
-        </w:rPr>
-        <w:t xml:space="preserve">Note: </w:t>
-      </w:r>
-      <w:r>
-        <w:t xml:space="preserve">PostgreSQL, Redis, and Ollama are </w:t>
-      </w:r>
-      <w:r>
-        <w:rPr>
-          <w:b/>
-        </w:rPr>
-        <w:t>not</w:t>
-      </w:r>
-      <w:r>
-        <w:t xml:space="preserve"> required for this tutorial. They are only used by the optional Docker deployment (Section 9).</w:t>
-      </w:r>
-    </w:p>
-    <w:p>
-      <w:pPr>
-        <w:pStyle w:val="Heading2"/>
-      </w:pPr>
-      <w:r>
-        <w:t>2. Clone the repository</w:t>
-      </w:r>
-    </w:p>
-    <w:p>
-      <w:pPr>
-        <w:spacing w:after="0"/>
-        <w:ind w:left="240"/>
-        <w:shd w:val="clear" w:fill="F2F2F2"/>
-      </w:pPr>
-      <w:r>
-        <w:rPr>
-          <w:rFonts w:ascii="Consolas" w:hAnsi="Consolas"/>
-          <w:sz w:val="19"/>
-        </w:rPr>
-        <w:t>git clone https://github.com/zakusworo/solara-optima-platform</w:t>
-      </w:r>
-    </w:p>
-    <w:p>
-      <w:pPr>
-        <w:spacing w:after="0"/>
-        <w:ind w:left="240"/>
-        <w:shd w:val="clear" w:fill="F2F2F2"/>
-      </w:pPr>
-      <w:r>
-        <w:rPr>
-          <w:rFonts w:ascii="Consolas" w:hAnsi="Consolas"/>
-          <w:sz w:val="19"/>
-        </w:rPr>
-        <w:t>cd solara-optima-platform</w:t>
-      </w:r>
-    </w:p>
-    <w:p>
-      <w:pPr>
-        <w:spacing w:after="40"/>
-      </w:pPr>
-    </w:p>
-    <w:p>
-      <w:r>
-        <w:t xml:space="preserve">Expected: the folder contains </w:t>
-      </w:r>
-      <w:r>
-        <w:rPr>
-          <w:rFonts w:ascii="Consolas" w:hAnsi="Consolas"/>
-          <w:sz w:val="20"/>
-        </w:rPr>
-        <w:t>backend/</w:t>
-      </w:r>
-      <w:r>
-        <w:t xml:space="preserve">, </w:t>
-      </w:r>
-      <w:r>
-        <w:rPr>
-          <w:rFonts w:ascii="Consolas" w:hAnsi="Consolas"/>
-          <w:sz w:val="20"/>
-        </w:rPr>
-        <w:t>frontend/</w:t>
-      </w:r>
-      <w:r>
-        <w:t xml:space="preserve">, </w:t>
-      </w:r>
-      <w:r>
-        <w:rPr>
-          <w:rFonts w:ascii="Consolas" w:hAnsi="Consolas"/>
-          <w:sz w:val="20"/>
-        </w:rPr>
-        <w:t>data/</w:t>
-      </w:r>
-      <w:r>
-        <w:t xml:space="preserve">, </w:t>
-      </w:r>
-      <w:r>
-        <w:rPr>
-          <w:rFonts w:ascii="Consolas" w:hAnsi="Consolas"/>
-          <w:sz w:val="20"/>
-        </w:rPr>
-        <w:t>docs/</w:t>
-      </w:r>
-      <w:r>
-        <w:t xml:space="preserve">, </w:t>
-      </w:r>
-      <w:r>
-        <w:rPr>
-          <w:rFonts w:ascii="Consolas" w:hAnsi="Consolas"/>
-          <w:sz w:val="20"/>
-        </w:rPr>
-        <w:t>docker-compose.yml</w:t>
-      </w:r>
-      <w:r>
-        <w:t xml:space="preserve">, and </w:t>
+        <w:t xml:space="preserve">Not installed yet? Follow the install steps in </w:t>
       </w:r>
       <w:r>
         <w:rPr>
@@ -440,95 +50,12 @@
         <w:t>QUICKSTART.md</w:t>
       </w:r>
       <w:r>
-        <w:t>.</w:t>
+        <w:t xml:space="preserve"> first (clone, backend pip install, frontend npm install). You only do that once.</w:t>
       </w:r>
     </w:p>
     <w:p>
-      <w:pPr>
-        <w:pStyle w:val="Heading2"/>
-      </w:pPr>
       <w:r>
-        <w:t>3. Set up the backend</w:t>
-      </w:r>
-    </w:p>
-    <w:p>
-      <w:pPr>
-        <w:spacing w:after="0"/>
-        <w:ind w:left="240"/>
-        <w:shd w:val="clear" w:fill="F2F2F2"/>
-      </w:pPr>
-      <w:r>
-        <w:rPr>
-          <w:rFonts w:ascii="Consolas" w:hAnsi="Consolas"/>
-          <w:sz w:val="19"/>
-        </w:rPr>
-        <w:t>cd backend</w:t>
-      </w:r>
-    </w:p>
-    <w:p>
-      <w:pPr>
-        <w:spacing w:after="0"/>
-        <w:ind w:left="240"/>
-        <w:shd w:val="clear" w:fill="F2F2F2"/>
-      </w:pPr>
-      <w:r>
-        <w:rPr>
-          <w:rFonts w:ascii="Consolas" w:hAnsi="Consolas"/>
-          <w:sz w:val="19"/>
-        </w:rPr>
-        <w:t>python3 -m venv venv</w:t>
-      </w:r>
-    </w:p>
-    <w:p>
-      <w:pPr>
-        <w:spacing w:after="0"/>
-        <w:ind w:left="240"/>
-        <w:shd w:val="clear" w:fill="F2F2F2"/>
-      </w:pPr>
-      <w:r>
-        <w:rPr>
-          <w:rFonts w:ascii="Consolas" w:hAnsi="Consolas"/>
-          <w:sz w:val="19"/>
-        </w:rPr>
-        <w:t>source venv/bin/activate          # Windows: venv\Scripts\activate</w:t>
-      </w:r>
-    </w:p>
-    <w:p>
-      <w:pPr>
-        <w:spacing w:after="0"/>
-        <w:ind w:left="240"/>
-        <w:shd w:val="clear" w:fill="F2F2F2"/>
-      </w:pPr>
-      <w:r>
-        <w:rPr>
-          <w:rFonts w:ascii="Consolas" w:hAnsi="Consolas"/>
-          <w:sz w:val="19"/>
-        </w:rPr>
-        <w:t>pip install -r requirements-minimal.txt</w:t>
-      </w:r>
-    </w:p>
-    <w:p>
-      <w:pPr>
-        <w:spacing w:after="0"/>
-        <w:ind w:left="240"/>
-        <w:shd w:val="clear" w:fill="F2F2F2"/>
-      </w:pPr>
-      <w:r>
-        <w:rPr>
-          <w:rFonts w:ascii="Consolas" w:hAnsi="Consolas"/>
-          <w:sz w:val="19"/>
-        </w:rPr>
-        <w:t>cp .env.example .env</w:t>
-      </w:r>
-    </w:p>
-    <w:p>
-      <w:pPr>
-        <w:spacing w:after="40"/>
-      </w:pPr>
-    </w:p>
-    <w:p>
-      <w:r>
-        <w:t>The install takes a few minutes (pvlib, pandas, numpy, PuLP with the bundled CBC solver).</w:t>
+        <w:t>Open two terminals in the project folder.</w:t>
       </w:r>
     </w:p>
     <w:p>
@@ -536,177 +63,7 @@
         <w:rPr>
           <w:b/>
         </w:rPr>
-        <w:t xml:space="preserve">Important — edit .env before starting. </w:t>
-      </w:r>
-      <w:r>
-        <w:t xml:space="preserve">The example file includes three </w:t>
-      </w:r>
-      <w:r>
-        <w:rPr>
-          <w:rFonts w:ascii="Consolas" w:hAnsi="Consolas"/>
-          <w:sz w:val="20"/>
-        </w:rPr>
-        <w:t>POSTGRES_*</w:t>
-      </w:r>
-      <w:r>
-        <w:t xml:space="preserve"> variables that are only used by Docker Compose. The app rejects unknown variables, so comment them out:</w:t>
-      </w:r>
-    </w:p>
-    <w:p>
-      <w:pPr>
-        <w:spacing w:after="0"/>
-        <w:ind w:left="240"/>
-        <w:shd w:val="clear" w:fill="F2F2F2"/>
-      </w:pPr>
-      <w:r>
-        <w:rPr>
-          <w:rFonts w:ascii="Consolas" w:hAnsi="Consolas"/>
-          <w:sz w:val="19"/>
-        </w:rPr>
-        <w:t>sed -i 's/^POSTGRES_/# POSTGRES_/' .env</w:t>
-      </w:r>
-    </w:p>
-    <w:p>
-      <w:pPr>
-        <w:spacing w:after="40"/>
-      </w:pPr>
-    </w:p>
-    <w:p>
-      <w:r>
-        <w:t>If you skip this you will see on startup:</w:t>
-      </w:r>
-    </w:p>
-    <w:p>
-      <w:pPr>
-        <w:spacing w:after="0"/>
-        <w:ind w:left="240"/>
-        <w:shd w:val="clear" w:fill="F2F2F2"/>
-      </w:pPr>
-      <w:r>
-        <w:rPr>
-          <w:rFonts w:ascii="Consolas" w:hAnsi="Consolas"/>
-          <w:sz w:val="19"/>
-        </w:rPr>
-        <w:t>pydantic_core._pydantic_core.ValidationError: 3 validation errors for Settings</w:t>
-      </w:r>
-    </w:p>
-    <w:p>
-      <w:pPr>
-        <w:spacing w:after="0"/>
-        <w:ind w:left="240"/>
-        <w:shd w:val="clear" w:fill="F2F2F2"/>
-      </w:pPr>
-      <w:r>
-        <w:rPr>
-          <w:rFonts w:ascii="Consolas" w:hAnsi="Consolas"/>
-          <w:sz w:val="19"/>
-        </w:rPr>
-        <w:t>POSTGRES_USER</w:t>
-      </w:r>
-    </w:p>
-    <w:p>
-      <w:pPr>
-        <w:spacing w:after="0"/>
-        <w:ind w:left="240"/>
-        <w:shd w:val="clear" w:fill="F2F2F2"/>
-      </w:pPr>
-      <w:r>
-        <w:rPr>
-          <w:rFonts w:ascii="Consolas" w:hAnsi="Consolas"/>
-          <w:sz w:val="19"/>
-        </w:rPr>
-        <w:t xml:space="preserve">  Extra inputs are not permitted ...</w:t>
-      </w:r>
-    </w:p>
-    <w:p>
-      <w:pPr>
-        <w:spacing w:after="40"/>
-      </w:pPr>
-    </w:p>
-    <w:p>
-      <w:pPr>
-        <w:pStyle w:val="Heading2"/>
-      </w:pPr>
-      <w:r>
-        <w:t>4. Set up the frontend</w:t>
-      </w:r>
-    </w:p>
-    <w:p>
-      <w:pPr>
-        <w:spacing w:after="0"/>
-        <w:ind w:left="240"/>
-        <w:shd w:val="clear" w:fill="F2F2F2"/>
-      </w:pPr>
-      <w:r>
-        <w:rPr>
-          <w:rFonts w:ascii="Consolas" w:hAnsi="Consolas"/>
-          <w:sz w:val="19"/>
-        </w:rPr>
-        <w:t>cd ../frontend</w:t>
-      </w:r>
-    </w:p>
-    <w:p>
-      <w:pPr>
-        <w:spacing w:after="0"/>
-        <w:ind w:left="240"/>
-        <w:shd w:val="clear" w:fill="F2F2F2"/>
-      </w:pPr>
-      <w:r>
-        <w:rPr>
-          <w:rFonts w:ascii="Consolas" w:hAnsi="Consolas"/>
-          <w:sz w:val="19"/>
-        </w:rPr>
-        <w:t>npm install</w:t>
-      </w:r>
-    </w:p>
-    <w:p>
-      <w:pPr>
-        <w:spacing w:after="40"/>
-      </w:pPr>
-    </w:p>
-    <w:p>
-      <w:r>
-        <w:t xml:space="preserve">Expected: finishes with </w:t>
-      </w:r>
-      <w:r>
-        <w:rPr>
-          <w:rFonts w:ascii="Consolas" w:hAnsi="Consolas"/>
-          <w:sz w:val="20"/>
-        </w:rPr>
-        <w:t>added ~650 packages</w:t>
-      </w:r>
-      <w:r>
-        <w:t xml:space="preserve"> and </w:t>
-      </w:r>
-      <w:r>
-        <w:rPr>
-          <w:b/>
-        </w:rPr>
-        <w:t>0 vulnerabilities</w:t>
-      </w:r>
-      <w:r>
-        <w:t>.</w:t>
-      </w:r>
-    </w:p>
-    <w:p>
-      <w:pPr>
-        <w:pStyle w:val="Heading2"/>
-      </w:pPr>
-      <w:r>
-        <w:t>5. Start both servers</w:t>
-      </w:r>
-    </w:p>
-    <w:p>
-      <w:r>
-        <w:t>Use two terminals (or run each in the background).</w:t>
-      </w:r>
-    </w:p>
-    <w:p>
-      <w:r>
-        <w:rPr>
-          <w:b/>
-        </w:rPr>
-        <w:t>Terminal 1 — backend:</w:t>
+        <w:t>Terminal 1 — the engine (backend):</w:t>
       </w:r>
     </w:p>
     <w:p>
@@ -758,50 +115,22 @@
     </w:p>
     <w:p>
       <w:r>
-        <w:t>Expected output ends with:</w:t>
+        <w:t xml:space="preserve">Wait for the line: </w:t>
       </w:r>
-    </w:p>
-    <w:p>
-      <w:pPr>
-        <w:spacing w:after="0"/>
-        <w:ind w:left="240"/>
-        <w:shd w:val="clear" w:fill="EAF1DD"/>
-      </w:pPr>
       <w:r>
         <w:rPr>
           <w:rFonts w:ascii="Consolas" w:hAnsi="Consolas"/>
-          <w:color w:val="375623"/>
-          <w:sz w:val="19"/>
+          <w:sz w:val="20"/>
         </w:rPr>
-        <w:t>INFO:     Uvicorn running on http://0.0.0.0:8000 (Press CTRL+C to quit)</w:t>
+        <w:t>Application startup complete.</w:t>
       </w:r>
-    </w:p>
-    <w:p>
-      <w:pPr>
-        <w:spacing w:after="0"/>
-        <w:ind w:left="240"/>
-        <w:shd w:val="clear" w:fill="EAF1DD"/>
-      </w:pPr>
-      <w:r>
-        <w:rPr>
-          <w:rFonts w:ascii="Consolas" w:hAnsi="Consolas"/>
-          <w:color w:val="375623"/>
-          <w:sz w:val="19"/>
-        </w:rPr>
-        <w:t>INFO:     Application startup complete.</w:t>
-      </w:r>
-    </w:p>
-    <w:p>
-      <w:pPr>
-        <w:spacing w:after="40"/>
-      </w:pPr>
     </w:p>
     <w:p>
       <w:r>
         <w:rPr>
           <w:b/>
         </w:rPr>
-        <w:t>Terminal 2 — frontend:</w:t>
+        <w:t>Terminal 2 — the website (frontend):</w:t>
       </w:r>
     </w:p>
     <w:p>
@@ -839,99 +168,19 @@
     </w:p>
     <w:p>
       <w:r>
-        <w:t>Expected output:</w:t>
+        <w:t xml:space="preserve">Wait for: </w:t>
+      </w:r>
+      <w:r>
+        <w:rPr>
+          <w:rFonts w:ascii="Consolas" w:hAnsi="Consolas"/>
+          <w:sz w:val="20"/>
+        </w:rPr>
+        <w:t>Local: http://localhost:3000/</w:t>
       </w:r>
     </w:p>
     <w:p>
-      <w:pPr>
-        <w:spacing w:after="0"/>
-        <w:ind w:left="240"/>
-        <w:shd w:val="clear" w:fill="EAF1DD"/>
-      </w:pPr>
       <w:r>
-        <w:rPr>
-          <w:rFonts w:ascii="Consolas" w:hAnsi="Consolas"/>
-          <w:color w:val="375623"/>
-          <w:sz w:val="19"/>
-        </w:rPr>
-        <w:t>VITE ready in ~1s</w:t>
-      </w:r>
-    </w:p>
-    <w:p>
-      <w:pPr>
-        <w:spacing w:after="0"/>
-        <w:ind w:left="240"/>
-        <w:shd w:val="clear" w:fill="EAF1DD"/>
-      </w:pPr>
-      <w:r>
-        <w:rPr>
-          <w:rFonts w:ascii="Consolas" w:hAnsi="Consolas"/>
-          <w:color w:val="375623"/>
-          <w:sz w:val="19"/>
-        </w:rPr>
-        <w:t>-&gt;  Local:   http://localhost:3000/</w:t>
-      </w:r>
-    </w:p>
-    <w:p>
-      <w:pPr>
-        <w:spacing w:after="40"/>
-      </w:pPr>
-    </w:p>
-    <w:p>
-      <w:pPr>
-        <w:pStyle w:val="Heading2"/>
-      </w:pPr>
-      <w:r>
-        <w:t>6. Verify everything is up</w:t>
-      </w:r>
-    </w:p>
-    <w:p>
-      <w:pPr>
-        <w:spacing w:after="0"/>
-        <w:ind w:left="240"/>
-        <w:shd w:val="clear" w:fill="F2F2F2"/>
-      </w:pPr>
-      <w:r>
-        <w:rPr>
-          <w:rFonts w:ascii="Consolas" w:hAnsi="Consolas"/>
-          <w:sz w:val="19"/>
-        </w:rPr>
-        <w:t>curl http://localhost:8000/health</w:t>
-      </w:r>
-    </w:p>
-    <w:p>
-      <w:pPr>
-        <w:spacing w:after="40"/>
-      </w:pPr>
-    </w:p>
-    <w:p>
-      <w:r>
-        <w:t>Expected:</w:t>
-      </w:r>
-    </w:p>
-    <w:p>
-      <w:pPr>
-        <w:spacing w:after="0"/>
-        <w:ind w:left="240"/>
-        <w:shd w:val="clear" w:fill="EAF1DD"/>
-      </w:pPr>
-      <w:r>
-        <w:rPr>
-          <w:rFonts w:ascii="Consolas" w:hAnsi="Consolas"/>
-          <w:color w:val="375623"/>
-          <w:sz w:val="19"/>
-        </w:rPr>
-        <w:t>{"status":"ok","services":{"api":"running","optimization":"ready","forecasting":"ready"}}</w:t>
-      </w:r>
-    </w:p>
-    <w:p>
-      <w:pPr>
-        <w:spacing w:after="40"/>
-      </w:pPr>
-    </w:p>
-    <w:p>
-      <w:r>
-        <w:t xml:space="preserve">Then open </w:t>
+        <w:t xml:space="preserve">Now open </w:t>
       </w:r>
       <w:r>
         <w:rPr>
@@ -940,16 +189,16 @@
         <w:t>http://localhost:3000</w:t>
       </w:r>
       <w:r>
-        <w:t xml:space="preserve"> in your browser — the Dashboard loads with the Bandung location pre-configured (-6.9147°S, 107.6098°E, 768 m). The interactive API reference lives at </w:t>
+        <w:t xml:space="preserve"> in your browser. You should see the </w:t>
       </w:r>
       <w:r>
         <w:rPr>
           <w:b/>
         </w:rPr>
-        <w:t>http://localhost:8000/docs</w:t>
+        <w:t>Dashboard</w:t>
       </w:r>
       <w:r>
-        <w:t>.</w:t>
+        <w:t xml:space="preserve"> with a "System Ready" badge, a Solar Resource Assessment for Bandung, and a monthly irradiance chart. If the panels show errors instead, the backend isn't running — check Terminal 1.</w:t>
       </w:r>
     </w:p>
     <w:p>
@@ -957,40 +206,228 @@
         <w:pStyle w:val="Heading2"/>
       </w:pPr>
       <w:r>
-        <w:t>7. Get your first results</w:t>
+        <w:t>2. Know your way around</w:t>
       </w:r>
     </w:p>
     <w:p>
+      <w:r>
+        <w:t>The sidebar has six pages. You will use them in this order:</w:t>
+      </w:r>
+    </w:p>
+    <w:tbl>
+      <w:tblPr>
+        <w:tblStyle w:val="LightGrid-Accent1"/>
+        <w:tblW w:type="auto" w:w="0"/>
+        <w:tblLook w:firstColumn="1" w:firstRow="1" w:lastColumn="0" w:lastRow="0" w:noHBand="0" w:noVBand="1" w:val="04A0"/>
+      </w:tblPr>
+      <w:tblGrid>
+        <w:gridCol w:w="4320"/>
+        <w:gridCol w:w="4320"/>
+      </w:tblGrid>
+      <w:tr>
+        <w:tc>
+          <w:tcPr>
+            <w:tcW w:type="dxa" w:w="4320"/>
+          </w:tcPr>
+          <w:p>
+            <w:r>
+              <w:rPr>
+                <w:b/>
+              </w:rPr>
+              <w:t>Page</w:t>
+            </w:r>
+          </w:p>
+        </w:tc>
+        <w:tc>
+          <w:tcPr>
+            <w:tcW w:type="dxa" w:w="4320"/>
+          </w:tcPr>
+          <w:p>
+            <w:r>
+              <w:rPr>
+                <w:b/>
+              </w:rPr>
+              <w:t>What it's for</w:t>
+            </w:r>
+          </w:p>
+        </w:tc>
+      </w:tr>
+      <w:tr>
+        <w:tc>
+          <w:tcPr>
+            <w:tcW w:type="dxa" w:w="4320"/>
+          </w:tcPr>
+          <w:p>
+            <w:r>
+              <w:rPr>
+                <w:sz w:val="20"/>
+              </w:rPr>
+              <w:t>Dashboard</w:t>
+            </w:r>
+          </w:p>
+        </w:tc>
+        <w:tc>
+          <w:tcPr>
+            <w:tcW w:type="dxa" w:w="4320"/>
+          </w:tcPr>
+          <w:p>
+            <w:r>
+              <w:rPr>
+                <w:sz w:val="20"/>
+              </w:rPr>
+              <w:t>Overview: solar resource at your location, quick links</w:t>
+            </w:r>
+          </w:p>
+        </w:tc>
+      </w:tr>
+      <w:tr>
+        <w:tc>
+          <w:tcPr>
+            <w:tcW w:type="dxa" w:w="4320"/>
+          </w:tcPr>
+          <w:p>
+            <w:r>
+              <w:rPr>
+                <w:sz w:val="20"/>
+              </w:rPr>
+              <w:t>Settings</w:t>
+            </w:r>
+          </w:p>
+        </w:tc>
+        <w:tc>
+          <w:tcPr>
+            <w:tcW w:type="dxa" w:w="4320"/>
+          </w:tcPr>
+          <w:p>
+            <w:r>
+              <w:rPr>
+                <w:sz w:val="20"/>
+              </w:rPr>
+              <w:t>Where your site is (city, coordinates) and market prices</w:t>
+            </w:r>
+          </w:p>
+        </w:tc>
+      </w:tr>
+      <w:tr>
+        <w:tc>
+          <w:tcPr>
+            <w:tcW w:type="dxa" w:w="4320"/>
+          </w:tcPr>
+          <w:p>
+            <w:r>
+              <w:rPr>
+                <w:sz w:val="20"/>
+              </w:rPr>
+              <w:t>Solar Forecast</w:t>
+            </w:r>
+          </w:p>
+        </w:tc>
+        <w:tc>
+          <w:tcPr>
+            <w:tcW w:type="dxa" w:w="4320"/>
+          </w:tcPr>
+          <w:p>
+            <w:r>
+              <w:rPr>
+                <w:sz w:val="20"/>
+              </w:rPr>
+              <w:t>Preview how much energy your solar panels would make</w:t>
+            </w:r>
+          </w:p>
+        </w:tc>
+      </w:tr>
+      <w:tr>
+        <w:tc>
+          <w:tcPr>
+            <w:tcW w:type="dxa" w:w="4320"/>
+          </w:tcPr>
+          <w:p>
+            <w:r>
+              <w:rPr>
+                <w:sz w:val="20"/>
+              </w:rPr>
+              <w:t>Generators</w:t>
+            </w:r>
+          </w:p>
+        </w:tc>
+        <w:tc>
+          <w:tcPr>
+            <w:tcW w:type="dxa" w:w="4320"/>
+          </w:tcPr>
+          <w:p>
+            <w:r>
+              <w:rPr>
+                <w:sz w:val="20"/>
+              </w:rPr>
+              <w:t>Build your equipment list: solar size, battery, generators</w:t>
+            </w:r>
+          </w:p>
+        </w:tc>
+      </w:tr>
+      <w:tr>
+        <w:tc>
+          <w:tcPr>
+            <w:tcW w:type="dxa" w:w="4320"/>
+          </w:tcPr>
+          <w:p>
+            <w:r>
+              <w:rPr>
+                <w:sz w:val="20"/>
+              </w:rPr>
+              <w:t>Optimization</w:t>
+            </w:r>
+          </w:p>
+        </w:tc>
+        <w:tc>
+          <w:tcPr>
+            <w:tcW w:type="dxa" w:w="4320"/>
+          </w:tcPr>
+          <w:p>
+            <w:r>
+              <w:rPr>
+                <w:sz w:val="20"/>
+              </w:rPr>
+              <w:t>Run the calculation and see the results</w:t>
+            </w:r>
+          </w:p>
+        </w:tc>
+      </w:tr>
+      <w:tr>
+        <w:tc>
+          <w:tcPr>
+            <w:tcW w:type="dxa" w:w="4320"/>
+          </w:tcPr>
+          <w:p>
+            <w:r>
+              <w:rPr>
+                <w:sz w:val="20"/>
+              </w:rPr>
+              <w:t>Marketplace</w:t>
+            </w:r>
+          </w:p>
+        </w:tc>
+        <w:tc>
+          <w:tcPr>
+            <w:tcW w:type="dxa" w:w="4320"/>
+          </w:tcPr>
+          <w:p>
+            <w:r>
+              <w:rPr>
+                <w:sz w:val="20"/>
+              </w:rPr>
+              <w:t>Bonus: rooftop solar cost estimate for your electricity bill</w:t>
+            </w:r>
+          </w:p>
+        </w:tc>
+      </w:tr>
+    </w:tbl>
+    <w:p/>
+    <w:p>
       <w:pPr>
-        <w:pStyle w:val="Heading3"/>
+        <w:pStyle w:val="Heading2"/>
       </w:pPr>
       <w:r>
-        <w:t>7a. Run an optimization from the UI</w:t>
-      </w:r>
-    </w:p>
-    <w:p>
-      <w:pPr>
-        <w:pStyle w:val="ListNumber"/>
-      </w:pPr>
-      <w:r>
-        <w:t xml:space="preserve">Open </w:t>
-      </w:r>
-      <w:r>
-        <w:rPr>
-          <w:b/>
-        </w:rPr>
-        <w:t>http://localhost:3000/optimize</w:t>
-      </w:r>
-      <w:r>
-        <w:t>.</w:t>
-      </w:r>
-    </w:p>
-    <w:p>
-      <w:pPr>
-        <w:pStyle w:val="ListNumber"/>
-      </w:pPr>
-      <w:r>
-        <w:t>The form is pre-filled with a 24-hour load profile, a generator fleet, 100 kW of PV, and a 50 kWh / 25 kW battery.</w:t>
+        <w:t>3. Set your location (Settings)</w:t>
       </w:r>
     </w:p>
     <w:p>
@@ -1004,449 +441,102 @@
         <w:rPr>
           <w:b/>
         </w:rPr>
-        <w:t>Run Optimization</w:t>
+        <w:t>Settings</w:t>
+      </w:r>
+      <w:r>
+        <w:t xml:space="preserve"> in the sidebar.</w:t>
+      </w:r>
+    </w:p>
+    <w:p>
+      <w:pPr>
+        <w:pStyle w:val="ListNumber"/>
+      </w:pPr>
+      <w:r>
+        <w:t xml:space="preserve">The app comes pre-configured for </w:t>
+      </w:r>
+      <w:r>
+        <w:rPr>
+          <w:b/>
+        </w:rPr>
+        <w:t>Bandung, Indonesia</w:t>
+      </w:r>
+      <w:r>
+        <w:t>. If that's fine, skip to step 4.</w:t>
+      </w:r>
+    </w:p>
+    <w:p>
+      <w:pPr>
+        <w:pStyle w:val="ListNumber"/>
+      </w:pPr>
+      <w:r>
+        <w:t xml:space="preserve">To change it: type a city name in the location search box, pick a result, and the </w:t>
+      </w:r>
+      <w:r>
+        <w:rPr>
+          <w:b/>
+        </w:rPr>
+        <w:t>Latitude</w:t>
+      </w:r>
+      <w:r>
+        <w:t xml:space="preserve">, </w:t>
+      </w:r>
+      <w:r>
+        <w:rPr>
+          <w:b/>
+        </w:rPr>
+        <w:t>Longitude</w:t>
+      </w:r>
+      <w:r>
+        <w:t xml:space="preserve">, </w:t>
+      </w:r>
+      <w:r>
+        <w:rPr>
+          <w:b/>
+        </w:rPr>
+        <w:t>Altitude</w:t>
+      </w:r>
+      <w:r>
+        <w:t xml:space="preserve"> and timezone fill in automatically. Click </w:t>
+      </w:r>
+      <w:r>
+        <w:rPr>
+          <w:b/>
+        </w:rPr>
+        <w:t>Save</w:t>
       </w:r>
       <w:r>
         <w:t>.</w:t>
       </w:r>
     </w:p>
     <w:p>
+      <w:pPr>
+        <w:pStyle w:val="ListNumber"/>
+      </w:pPr>
       <w:r>
-        <w:t xml:space="preserve">Expected result: solver status </w:t>
+        <w:t xml:space="preserve">Notice the </w:t>
       </w:r>
       <w:r>
         <w:rPr>
           <w:b/>
         </w:rPr>
-        <w:t>Optimal</w:t>
+        <w:t>Optimal PV Tilt</w:t>
       </w:r>
       <w:r>
-        <w:t>, a total cost in IDR (~ Rp 3–4 million for the default scenario), and charts showing the generator schedule, solar output, and battery charge/discharge over 24 hours.</w:t>
-      </w:r>
-    </w:p>
-    <w:p>
-      <w:pPr>
-        <w:pStyle w:val="Heading3"/>
-      </w:pPr>
-      <w:r>
-        <w:t>7b. Run the same optimization from the command line</w:t>
-      </w:r>
-    </w:p>
-    <w:p>
-      <w:pPr>
-        <w:spacing w:after="0"/>
-        <w:ind w:left="240"/>
-        <w:shd w:val="clear" w:fill="F2F2F2"/>
-      </w:pPr>
-      <w:r>
-        <w:rPr>
-          <w:rFonts w:ascii="Consolas" w:hAnsi="Consolas"/>
-          <w:sz w:val="19"/>
-        </w:rPr>
-        <w:t>curl -X POST http://localhost:8000/api/v1/optimize/run-with-solar \</w:t>
-      </w:r>
-    </w:p>
-    <w:p>
-      <w:pPr>
-        <w:spacing w:after="0"/>
-        <w:ind w:left="240"/>
-        <w:shd w:val="clear" w:fill="F2F2F2"/>
-      </w:pPr>
-      <w:r>
-        <w:rPr>
-          <w:rFonts w:ascii="Consolas" w:hAnsi="Consolas"/>
-          <w:sz w:val="19"/>
-        </w:rPr>
-        <w:t xml:space="preserve">  -H "Content-Type: application/json" \</w:t>
-      </w:r>
-    </w:p>
-    <w:p>
-      <w:pPr>
-        <w:spacing w:after="0"/>
-        <w:ind w:left="240"/>
-        <w:shd w:val="clear" w:fill="F2F2F2"/>
-      </w:pPr>
-      <w:r>
-        <w:rPr>
-          <w:rFonts w:ascii="Consolas" w:hAnsi="Consolas"/>
-          <w:sz w:val="19"/>
-        </w:rPr>
-        <w:t xml:space="preserve">  -d '{</w:t>
-      </w:r>
-    </w:p>
-    <w:p>
-      <w:pPr>
-        <w:spacing w:after="0"/>
-        <w:ind w:left="240"/>
-        <w:shd w:val="clear" w:fill="F2F2F2"/>
-      </w:pPr>
-      <w:r>
-        <w:rPr>
-          <w:rFonts w:ascii="Consolas" w:hAnsi="Consolas"/>
-          <w:sz w:val="19"/>
-        </w:rPr>
-        <w:t xml:space="preserve">    "load_profile": [80,75,70,65,60,65,85,100,120,130,125,120,115,110,115,125,140,160,170,165,150,130,110,95],</w:t>
-      </w:r>
-    </w:p>
-    <w:p>
-      <w:pPr>
-        <w:spacing w:after="0"/>
-        <w:ind w:left="240"/>
-        <w:shd w:val="clear" w:fill="F2F2F2"/>
-      </w:pPr>
-      <w:r>
-        <w:rPr>
-          <w:rFonts w:ascii="Consolas" w:hAnsi="Consolas"/>
-          <w:sz w:val="19"/>
-        </w:rPr>
-        <w:t xml:space="preserve">    "generators": [{</w:t>
-      </w:r>
-    </w:p>
-    <w:p>
-      <w:pPr>
-        <w:spacing w:after="0"/>
-        <w:ind w:left="240"/>
-        <w:shd w:val="clear" w:fill="F2F2F2"/>
-      </w:pPr>
-      <w:r>
-        <w:rPr>
-          <w:rFonts w:ascii="Consolas" w:hAnsi="Consolas"/>
-          <w:sz w:val="19"/>
-        </w:rPr>
-        <w:t xml:space="preserve">      "generator_id": 1, "name": "Gas Turbine",</w:t>
-      </w:r>
-    </w:p>
-    <w:p>
-      <w:pPr>
-        <w:spacing w:after="0"/>
-        <w:ind w:left="240"/>
-        <w:shd w:val="clear" w:fill="F2F2F2"/>
-      </w:pPr>
-      <w:r>
-        <w:rPr>
-          <w:rFonts w:ascii="Consolas" w:hAnsi="Consolas"/>
-          <w:sz w:val="19"/>
-        </w:rPr>
-        <w:t xml:space="preserve">      "min_output": 20, "max_output": 200,</w:t>
-      </w:r>
-    </w:p>
-    <w:p>
-      <w:pPr>
-        <w:spacing w:after="0"/>
-        <w:ind w:left="240"/>
-        <w:shd w:val="clear" w:fill="F2F2F2"/>
-      </w:pPr>
-      <w:r>
-        <w:rPr>
-          <w:rFonts w:ascii="Consolas" w:hAnsi="Consolas"/>
-          <w:sz w:val="19"/>
-        </w:rPr>
-        <w:t xml:space="preserve">      "ramp_up": 100, "ramp_down": 100,</w:t>
-      </w:r>
-    </w:p>
-    <w:p>
-      <w:pPr>
-        <w:spacing w:after="0"/>
-        <w:ind w:left="240"/>
-        <w:shd w:val="clear" w:fill="F2F2F2"/>
-      </w:pPr>
-      <w:r>
-        <w:rPr>
-          <w:rFonts w:ascii="Consolas" w:hAnsi="Consolas"/>
-          <w:sz w:val="19"/>
-        </w:rPr>
-        <w:t xml:space="preserve">      "min_uptime": 2, "min_downtime": 2,</w:t>
-      </w:r>
-    </w:p>
-    <w:p>
-      <w:pPr>
-        <w:spacing w:after="0"/>
-        <w:ind w:left="240"/>
-        <w:shd w:val="clear" w:fill="F2F2F2"/>
-      </w:pPr>
-      <w:r>
-        <w:rPr>
-          <w:rFonts w:ascii="Consolas" w:hAnsi="Consolas"/>
-          <w:sz w:val="19"/>
-        </w:rPr>
-        <w:t xml:space="preserve">      "initial_status": 1, "initial_output": 50,</w:t>
-      </w:r>
-    </w:p>
-    <w:p>
-      <w:pPr>
-        <w:spacing w:after="0"/>
-        <w:ind w:left="240"/>
-        <w:shd w:val="clear" w:fill="F2F2F2"/>
-      </w:pPr>
-      <w:r>
-        <w:rPr>
-          <w:rFonts w:ascii="Consolas" w:hAnsi="Consolas"/>
-          <w:sz w:val="19"/>
-        </w:rPr>
-        <w:t xml:space="preserve">      "startup_cost": 500000, "shutdown_cost": 0,</w:t>
-      </w:r>
-    </w:p>
-    <w:p>
-      <w:pPr>
-        <w:spacing w:after="0"/>
-        <w:ind w:left="240"/>
-        <w:shd w:val="clear" w:fill="F2F2F2"/>
-      </w:pPr>
-      <w:r>
-        <w:rPr>
-          <w:rFonts w:ascii="Consolas" w:hAnsi="Consolas"/>
-          <w:sz w:val="19"/>
-        </w:rPr>
-        <w:t xml:space="preserve">      "no_load_cost": 50000, "fuel_cost": 800,</w:t>
-      </w:r>
-    </w:p>
-    <w:p>
-      <w:pPr>
-        <w:spacing w:after="0"/>
-        <w:ind w:left="240"/>
-        <w:shd w:val="clear" w:fill="F2F2F2"/>
-      </w:pPr>
-      <w:r>
-        <w:rPr>
-          <w:rFonts w:ascii="Consolas" w:hAnsi="Consolas"/>
-          <w:sz w:val="19"/>
-        </w:rPr>
-        <w:t xml:space="preserve">      "emissions_rate": 0.45</w:t>
-      </w:r>
-    </w:p>
-    <w:p>
-      <w:pPr>
-        <w:spacing w:after="0"/>
-        <w:ind w:left="240"/>
-        <w:shd w:val="clear" w:fill="F2F2F2"/>
-      </w:pPr>
-      <w:r>
-        <w:rPr>
-          <w:rFonts w:ascii="Consolas" w:hAnsi="Consolas"/>
-          <w:sz w:val="19"/>
-        </w:rPr>
-        <w:t xml:space="preserve">    }],</w:t>
-      </w:r>
-    </w:p>
-    <w:p>
-      <w:pPr>
-        <w:spacing w:after="0"/>
-        <w:ind w:left="240"/>
-        <w:shd w:val="clear" w:fill="F2F2F2"/>
-      </w:pPr>
-      <w:r>
-        <w:rPr>
-          <w:rFonts w:ascii="Consolas" w:hAnsi="Consolas"/>
-          <w:sz w:val="19"/>
-        </w:rPr>
-        <w:t xml:space="preserve">    "pv_system_capacity": 100,</w:t>
-      </w:r>
-    </w:p>
-    <w:p>
-      <w:pPr>
-        <w:spacing w:after="0"/>
-        <w:ind w:left="240"/>
-        <w:shd w:val="clear" w:fill="F2F2F2"/>
-      </w:pPr>
-      <w:r>
-        <w:rPr>
-          <w:rFonts w:ascii="Consolas" w:hAnsi="Consolas"/>
-          <w:sz w:val="19"/>
-        </w:rPr>
-        <w:t xml:space="preserve">    "bess_capacity": 50,</w:t>
-      </w:r>
-    </w:p>
-    <w:p>
-      <w:pPr>
-        <w:spacing w:after="0"/>
-        <w:ind w:left="240"/>
-        <w:shd w:val="clear" w:fill="F2F2F2"/>
-      </w:pPr>
-      <w:r>
-        <w:rPr>
-          <w:rFonts w:ascii="Consolas" w:hAnsi="Consolas"/>
-          <w:sz w:val="19"/>
-        </w:rPr>
-        <w:t xml:space="preserve">    "bess_power_rating": 25</w:t>
-      </w:r>
-    </w:p>
-    <w:p>
-      <w:pPr>
-        <w:spacing w:after="0"/>
-        <w:ind w:left="240"/>
-        <w:shd w:val="clear" w:fill="F2F2F2"/>
-      </w:pPr>
-      <w:r>
-        <w:rPr>
-          <w:rFonts w:ascii="Consolas" w:hAnsi="Consolas"/>
-          <w:sz w:val="19"/>
-        </w:rPr>
-        <w:t xml:space="preserve">  }' </w:t>
-      </w:r>
-    </w:p>
-    <w:p>
-      <w:pPr>
-        <w:spacing w:after="40"/>
-      </w:pPr>
-    </w:p>
-    <w:p>
-      <w:r>
-        <w:t xml:space="preserve">Expected: HTTP 200 with </w:t>
-      </w:r>
-      <w:r>
-        <w:rPr>
-          <w:rFonts w:ascii="Consolas" w:hAnsi="Consolas"/>
-          <w:sz w:val="20"/>
-        </w:rPr>
-        <w:t>"status": "Optimal"</w:t>
-      </w:r>
-      <w:r>
-        <w:t xml:space="preserve">, </w:t>
-      </w:r>
-      <w:r>
-        <w:rPr>
-          <w:rFonts w:ascii="Consolas" w:hAnsi="Consolas"/>
-          <w:sz w:val="20"/>
-        </w:rPr>
-        <w:t>"total_cost"</w:t>
-      </w:r>
-      <w:r>
-        <w:t xml:space="preserve"> ~ 3,000,000 IDR, and hour-by-hour </w:t>
-      </w:r>
-      <w:r>
-        <w:rPr>
-          <w:rFonts w:ascii="Consolas" w:hAnsi="Consolas"/>
-          <w:sz w:val="20"/>
-        </w:rPr>
-        <w:t>generator_schedules</w:t>
-      </w:r>
-      <w:r>
-        <w:t xml:space="preserve">, </w:t>
-      </w:r>
-      <w:r>
-        <w:rPr>
-          <w:rFonts w:ascii="Consolas" w:hAnsi="Consolas"/>
-          <w:sz w:val="20"/>
-        </w:rPr>
-        <w:t>solar_output</w:t>
-      </w:r>
-      <w:r>
-        <w:t xml:space="preserve">, and </w:t>
-      </w:r>
-      <w:r>
-        <w:rPr>
-          <w:rFonts w:ascii="Consolas" w:hAnsi="Consolas"/>
-          <w:sz w:val="20"/>
-        </w:rPr>
-        <w:t>battery_operation</w:t>
-      </w:r>
-      <w:r>
-        <w:t xml:space="preserve"> arrays. Solve time is well under a second.</w:t>
-      </w:r>
-    </w:p>
-    <w:p>
-      <w:pPr>
-        <w:shd w:val="clear" w:fill="EEF3FA"/>
-        <w:ind w:left="240"/>
-      </w:pPr>
-      <w:r>
-        <w:t xml:space="preserve">The generator must be able to cover the evening peak (170 in this profile) when solar is zero — that is why </w:t>
-      </w:r>
-      <w:r>
-        <w:rPr>
-          <w:rFonts w:ascii="Consolas" w:hAnsi="Consolas"/>
-          <w:sz w:val="20"/>
-        </w:rPr>
-        <w:t>max_output</w:t>
-      </w:r>
-      <w:r>
-        <w:t xml:space="preserve"> is 200 here. A 100-unit generator makes this scenario infeasible.</w:t>
-      </w:r>
-    </w:p>
-    <w:p>
-      <w:pPr>
-        <w:pStyle w:val="Heading3"/>
-      </w:pPr>
-      <w:r>
-        <w:t>7c. Get a solar forecast</w:t>
-      </w:r>
-    </w:p>
-    <w:p>
-      <w:pPr>
-        <w:spacing w:after="0"/>
-        <w:ind w:left="240"/>
-        <w:shd w:val="clear" w:fill="F2F2F2"/>
-      </w:pPr>
-      <w:r>
-        <w:rPr>
-          <w:rFonts w:ascii="Consolas" w:hAnsi="Consolas"/>
-          <w:sz w:val="19"/>
-        </w:rPr>
-        <w:t>curl "http://localhost:8000/api/v1/forecast/solar?capacity=100&amp;hours=24&amp;weather_source=clearsky"</w:t>
-      </w:r>
-    </w:p>
-    <w:p>
-      <w:pPr>
-        <w:spacing w:after="40"/>
-      </w:pPr>
-    </w:p>
-    <w:p>
-      <w:r>
-        <w:t>Expected: 24 hourly generation values for a 100 kW system in Bandung. On a clear-sky day this totals roughly 500–540 kWh with a midday peak around 73 kW.</w:t>
-      </w:r>
-    </w:p>
-    <w:p>
-      <w:pPr>
-        <w:pStyle w:val="Heading3"/>
-      </w:pPr>
-      <w:r>
-        <w:t>7d. Get a rooftop solar estimate (Marketplace)</w:t>
-      </w:r>
-    </w:p>
-    <w:p>
-      <w:r>
-        <w:t xml:space="preserve">Open </w:t>
+        <w:t xml:space="preserve"> and </w:t>
       </w:r>
       <w:r>
         <w:rPr>
           <w:b/>
         </w:rPr>
-        <w:t>http://localhost:3000/marketplace</w:t>
+        <w:t>Optimal PV Azimuth</w:t>
       </w:r>
       <w:r>
-        <w:t xml:space="preserve">, enter a monthly PLN bill (e.g. Rp 1,500,000, residential tariff), and click </w:t>
-      </w:r>
-      <w:r>
-        <w:rPr>
-          <w:b/>
-        </w:rPr>
-        <w:t>Estimate</w:t>
-      </w:r>
-      <w:r>
-        <w:t>.</w:t>
+        <w:t xml:space="preserve"> hints — the app knows that in the southern hemisphere panels should face north (azimuth 0°).</w:t>
       </w:r>
     </w:p>
     <w:p>
       <w:r>
-        <w:t xml:space="preserve">Expected result for that input: a recommended system of ~ </w:t>
-      </w:r>
-      <w:r>
-        <w:rPr>
-          <w:b/>
-        </w:rPr>
-        <w:t>4.8 kWp</w:t>
-      </w:r>
-      <w:r>
-        <w:t xml:space="preserve">, CAPEX ~ </w:t>
-      </w:r>
-      <w:r>
-        <w:rPr>
-          <w:b/>
-        </w:rPr>
-        <w:t>Rp 72 million</w:t>
-      </w:r>
-      <w:r>
-        <w:t>, yearly savings, payback period, IRR/NPV, three financing options (cash / green loan / zero-CapEx PPA), CO2 avoided, and a list of matched installers.</w:t>
+        <w:t>You can leave everything else (currency, solver) at its defaults: prices in Indonesian Rupiah and the free CBC solver.</w:t>
       </w:r>
     </w:p>
     <w:p>
@@ -1454,275 +544,30 @@
         <w:pStyle w:val="Heading2"/>
       </w:pPr>
       <w:r>
-        <w:t>8. Run the smoke tests</w:t>
+        <w:t>4. Configure the PV system (solar panels + battery)</w:t>
       </w:r>
     </w:p>
     <w:p>
       <w:r>
-        <w:t>The backend ships three script-style smoke tests. Run them directly with Python (not via pytest — they are scripts, not pytest suites):</w:t>
+        <w:t xml:space="preserve">Go to the </w:t>
       </w:r>
-    </w:p>
-    <w:p>
-      <w:pPr>
-        <w:spacing w:after="0"/>
-        <w:ind w:left="240"/>
-        <w:shd w:val="clear" w:fill="F2F2F2"/>
-      </w:pPr>
       <w:r>
         <w:rPr>
-          <w:rFonts w:ascii="Consolas" w:hAnsi="Consolas"/>
-          <w:sz w:val="19"/>
+          <w:b/>
         </w:rPr>
-        <w:t>cd backend</w:t>
+        <w:t>Generators</w:t>
       </w:r>
-    </w:p>
-    <w:p>
-      <w:pPr>
-        <w:spacing w:after="0"/>
-        <w:ind w:left="240"/>
-        <w:shd w:val="clear" w:fill="F2F2F2"/>
-      </w:pPr>
+      <w:r>
+        <w:t xml:space="preserve"> page. Despite the name, this page holds your whole equipment list, including solar and battery. Find the </w:t>
+      </w:r>
       <w:r>
         <w:rPr>
-          <w:rFonts w:ascii="Consolas" w:hAnsi="Consolas"/>
-          <w:sz w:val="19"/>
+          <w:b/>
         </w:rPr>
-        <w:t>source venv/bin/activate</w:t>
+        <w:t>System Configuration</w:t>
       </w:r>
-    </w:p>
-    <w:p>
-      <w:pPr>
-        <w:spacing w:after="0"/>
-        <w:ind w:left="240"/>
-        <w:shd w:val="clear" w:fill="F2F2F2"/>
-      </w:pPr>
       <w:r>
-        <w:rPr>
-          <w:rFonts w:ascii="Consolas" w:hAnsi="Consolas"/>
-          <w:sz w:val="19"/>
-        </w:rPr>
-        <w:t>python test_api.py             # core: optimizer + solar forecast</w:t>
-      </w:r>
-    </w:p>
-    <w:p>
-      <w:pPr>
-        <w:spacing w:after="0"/>
-        <w:ind w:left="240"/>
-        <w:shd w:val="clear" w:fill="F2F2F2"/>
-      </w:pPr>
-      <w:r>
-        <w:rPr>
-          <w:rFonts w:ascii="Consolas" w:hAnsi="Consolas"/>
-          <w:sz w:val="19"/>
-        </w:rPr>
-        <w:t>python test_marketplace.py     # financial model invariants</w:t>
-      </w:r>
-    </w:p>
-    <w:p>
-      <w:pPr>
-        <w:spacing w:after="0"/>
-        <w:ind w:left="240"/>
-        <w:shd w:val="clear" w:fill="F2F2F2"/>
-      </w:pPr>
-      <w:r>
-        <w:rPr>
-          <w:rFonts w:ascii="Consolas" w:hAnsi="Consolas"/>
-          <w:sz w:val="19"/>
-        </w:rPr>
-        <w:t>python test_marketplace_api.py # marketplace API end-to-end</w:t>
-      </w:r>
-    </w:p>
-    <w:p>
-      <w:pPr>
-        <w:spacing w:after="40"/>
-      </w:pPr>
-    </w:p>
-    <w:p>
-      <w:r>
-        <w:t>Expected — each exits 0 and prints its checks, e.g.:</w:t>
-      </w:r>
-    </w:p>
-    <w:p>
-      <w:pPr>
-        <w:spacing w:after="0"/>
-        <w:ind w:left="240"/>
-        <w:shd w:val="clear" w:fill="EAF1DD"/>
-      </w:pPr>
-      <w:r>
-        <w:rPr>
-          <w:rFonts w:ascii="Consolas" w:hAnsi="Consolas"/>
-          <w:color w:val="375623"/>
-          <w:sz w:val="19"/>
-        </w:rPr>
-        <w:t>v Optimization completed!</w:t>
-      </w:r>
-    </w:p>
-    <w:p>
-      <w:pPr>
-        <w:spacing w:after="0"/>
-        <w:ind w:left="240"/>
-        <w:shd w:val="clear" w:fill="EAF1DD"/>
-      </w:pPr>
-      <w:r>
-        <w:rPr>
-          <w:rFonts w:ascii="Consolas" w:hAnsi="Consolas"/>
-          <w:color w:val="375623"/>
-          <w:sz w:val="19"/>
-        </w:rPr>
-        <w:t xml:space="preserve">  Total cost: Rp 3,391,295</w:t>
-      </w:r>
-    </w:p>
-    <w:p>
-      <w:pPr>
-        <w:spacing w:after="0"/>
-        <w:ind w:left="240"/>
-        <w:shd w:val="clear" w:fill="EAF1DD"/>
-      </w:pPr>
-      <w:r>
-        <w:rPr>
-          <w:rFonts w:ascii="Consolas" w:hAnsi="Consolas"/>
-          <w:color w:val="375623"/>
-          <w:sz w:val="19"/>
-        </w:rPr>
-        <w:t>v Solar forecast generated</w:t>
-      </w:r>
-    </w:p>
-    <w:p>
-      <w:pPr>
-        <w:spacing w:after="0"/>
-        <w:ind w:left="240"/>
-        <w:shd w:val="clear" w:fill="EAF1DD"/>
-      </w:pPr>
-      <w:r>
-        <w:rPr>
-          <w:rFonts w:ascii="Consolas" w:hAnsi="Consolas"/>
-          <w:color w:val="375623"/>
-          <w:sz w:val="19"/>
-        </w:rPr>
-        <w:t xml:space="preserve">  Total generation: 535.1 kWh</w:t>
-      </w:r>
-    </w:p>
-    <w:p>
-      <w:pPr>
-        <w:spacing w:after="0"/>
-        <w:ind w:left="240"/>
-        <w:shd w:val="clear" w:fill="EAF1DD"/>
-      </w:pPr>
-      <w:r>
-        <w:rPr>
-          <w:rFonts w:ascii="Consolas" w:hAnsi="Consolas"/>
-          <w:color w:val="375623"/>
-          <w:sz w:val="19"/>
-        </w:rPr>
-        <w:t xml:space="preserve">  Peak power: 72.78 kW</w:t>
-      </w:r>
-    </w:p>
-    <w:p>
-      <w:pPr>
-        <w:spacing w:after="0"/>
-        <w:ind w:left="240"/>
-        <w:shd w:val="clear" w:fill="EAF1DD"/>
-      </w:pPr>
-      <w:r>
-        <w:rPr>
-          <w:rFonts w:ascii="Consolas" w:hAnsi="Consolas"/>
-          <w:color w:val="375623"/>
-          <w:sz w:val="19"/>
-        </w:rPr>
-        <w:t>...</w:t>
-      </w:r>
-    </w:p>
-    <w:p>
-      <w:pPr>
-        <w:spacing w:after="0"/>
-        <w:ind w:left="240"/>
-        <w:shd w:val="clear" w:fill="EAF1DD"/>
-      </w:pPr>
-      <w:r>
-        <w:rPr>
-          <w:rFonts w:ascii="Consolas" w:hAnsi="Consolas"/>
-          <w:color w:val="375623"/>
-          <w:sz w:val="19"/>
-        </w:rPr>
-        <w:t>All Marketplace API tests passed</w:t>
-      </w:r>
-    </w:p>
-    <w:p>
-      <w:pPr>
-        <w:spacing w:after="40"/>
-      </w:pPr>
-    </w:p>
-    <w:p>
-      <w:pPr>
-        <w:pStyle w:val="Heading2"/>
-      </w:pPr>
-      <w:r>
-        <w:t>9. Optional: full Docker deployment</w:t>
-      </w:r>
-    </w:p>
-    <w:p>
-      <w:r>
-        <w:t>The compose stack adds PostgreSQL, Redis, and Ollama (for the AI-forecast endpoints).</w:t>
-      </w:r>
-    </w:p>
-    <w:p>
-      <w:pPr>
-        <w:spacing w:after="0"/>
-        <w:ind w:left="240"/>
-        <w:shd w:val="clear" w:fill="F2F2F2"/>
-      </w:pPr>
-      <w:r>
-        <w:rPr>
-          <w:rFonts w:ascii="Consolas" w:hAnsi="Consolas"/>
-          <w:sz w:val="19"/>
-        </w:rPr>
-        <w:t># in backend/.env: set POSTGRES_USER, POSTGRES_PASSWORD, POSTGRES_DB</w:t>
-      </w:r>
-    </w:p>
-    <w:p>
-      <w:pPr>
-        <w:spacing w:after="0"/>
-        <w:ind w:left="240"/>
-        <w:shd w:val="clear" w:fill="F2F2F2"/>
-      </w:pPr>
-      <w:r>
-        <w:rPr>
-          <w:rFonts w:ascii="Consolas" w:hAnsi="Consolas"/>
-          <w:sz w:val="19"/>
-        </w:rPr>
-        <w:t># (uncomment the lines you commented out in step 3)</w:t>
-      </w:r>
-    </w:p>
-    <w:p>
-      <w:pPr>
-        <w:spacing w:after="0"/>
-        <w:ind w:left="240"/>
-        <w:shd w:val="clear" w:fill="F2F2F2"/>
-      </w:pPr>
-      <w:r>
-        <w:rPr>
-          <w:rFonts w:ascii="Consolas" w:hAnsi="Consolas"/>
-          <w:sz w:val="19"/>
-        </w:rPr>
-        <w:t>docker compose up --build -d</w:t>
-      </w:r>
-    </w:p>
-    <w:p>
-      <w:pPr>
-        <w:spacing w:after="40"/>
-      </w:pPr>
-    </w:p>
-    <w:p>
-      <w:r>
-        <w:t>Same URLs as dev mode: frontend on :3000, backend on :8000.</w:t>
-      </w:r>
-    </w:p>
-    <w:p>
-      <w:pPr>
-        <w:pStyle w:val="Heading2"/>
-      </w:pPr>
-      <w:r>
-        <w:t>10. Troubleshooting</w:t>
+        <w:t xml:space="preserve"> fields:</w:t>
       </w:r>
     </w:p>
     <w:tbl>
@@ -1746,7 +591,7 @@
               <w:rPr>
                 <w:b/>
               </w:rPr>
-              <w:t>Symptom</w:t>
+              <w:t>Field</w:t>
             </w:r>
           </w:p>
         </w:tc>
@@ -1759,7 +604,7 @@
               <w:rPr>
                 <w:b/>
               </w:rPr>
-              <w:t>Cause</w:t>
+              <w:t>Meaning</w:t>
             </w:r>
           </w:p>
         </w:tc>
@@ -1772,7 +617,7 @@
               <w:rPr>
                 <w:b/>
               </w:rPr>
-              <w:t>Fix</w:t>
+              <w:t>Good starter value</w:t>
             </w:r>
           </w:p>
         </w:tc>
@@ -1787,7 +632,7 @@
               <w:rPr>
                 <w:sz w:val="20"/>
               </w:rPr>
-              <w:t>Backend crashes at startup: ValidationError ... POSTGRES_USER Extra inputs are not permitted</w:t>
+              <w:t>Solar PV (kW)</w:t>
             </w:r>
           </w:p>
         </w:tc>
@@ -1800,7 +645,7 @@
               <w:rPr>
                 <w:sz w:val="20"/>
               </w:rPr>
-              <w:t>Docker-only variables left in .env</w:t>
+              <w:t>Total size of your solar array. 1 kW ≈ 2 large panels.</w:t>
             </w:r>
           </w:p>
         </w:tc>
@@ -1813,7 +658,7 @@
               <w:rPr>
                 <w:sz w:val="20"/>
               </w:rPr>
-              <w:t>Comment out the POSTGRES_* lines (step 3)</w:t>
+              <w:t>100</w:t>
             </w:r>
           </w:p>
         </w:tc>
@@ -1828,7 +673,7 @@
               <w:rPr>
                 <w:sz w:val="20"/>
               </w:rPr>
-              <w:t>422 Unprocessable Entity on /optimize/run</w:t>
+              <w:t>Battery (kWh)</w:t>
             </w:r>
           </w:p>
         </w:tc>
@@ -1841,7 +686,7 @@
               <w:rPr>
                 <w:sz w:val="20"/>
               </w:rPr>
-              <w:t>Generator payload missing shutdown_cost / no_load_cost</w:t>
+              <w:t>How much energy the battery can store.</w:t>
             </w:r>
           </w:p>
         </w:tc>
@@ -1854,7 +699,7 @@
               <w:rPr>
                 <w:sz w:val="20"/>
               </w:rPr>
-              <w:t>Include both fields on every generator</w:t>
+              <w:t>50</w:t>
             </w:r>
           </w:p>
         </w:tc>
@@ -1869,7 +714,7 @@
               <w:rPr>
                 <w:sz w:val="20"/>
               </w:rPr>
-              <w:t>Solver returns Infeasible</w:t>
+              <w:t>Battery Power (kW)</w:t>
             </w:r>
           </w:p>
         </w:tc>
@@ -1882,7 +727,7 @@
               <w:rPr>
                 <w:sz w:val="20"/>
               </w:rPr>
-              <w:t>Fleet cannot cover peak load when solar is zero</w:t>
+              <w:t>How fast the battery can charge/discharge.</w:t>
             </w:r>
           </w:p>
         </w:tc>
@@ -1895,7 +740,739 @@
               <w:rPr>
                 <w:sz w:val="20"/>
               </w:rPr>
-              <w:t>Raise max_output, add generators, or increase battery power</w:t>
+              <w:t>25</w:t>
+            </w:r>
+          </w:p>
+        </w:tc>
+      </w:tr>
+    </w:tbl>
+    <w:p/>
+    <w:p>
+      <w:r>
+        <w:rPr>
+          <w:b/>
+        </w:rPr>
+        <w:t xml:space="preserve">Optional — preview your solar production first. </w:t>
+      </w:r>
+      <w:r>
+        <w:t xml:space="preserve">Open the </w:t>
+      </w:r>
+      <w:r>
+        <w:rPr>
+          <w:b/>
+        </w:rPr>
+        <w:t>Solar Forecast</w:t>
+      </w:r>
+      <w:r>
+        <w:t xml:space="preserve"> page, set </w:t>
+      </w:r>
+      <w:r>
+        <w:rPr>
+          <w:b/>
+        </w:rPr>
+        <w:t>PV Capacity (kW)</w:t>
+      </w:r>
+      <w:r>
+        <w:t xml:space="preserve"> to the same number, and click the forecast button. You'll see a curve that is zero at night, rises after sunrise, and peaks around midday.</w:t>
+      </w:r>
+    </w:p>
+    <w:p>
+      <w:r>
+        <w:t xml:space="preserve">Expected for 100 kW in Bandung on a clear day: roughly </w:t>
+      </w:r>
+      <w:r>
+        <w:rPr>
+          <w:b/>
+        </w:rPr>
+        <w:t>500–540 kWh</w:t>
+      </w:r>
+      <w:r>
+        <w:t xml:space="preserve"> over the day with a midday peak near </w:t>
+      </w:r>
+      <w:r>
+        <w:rPr>
+          <w:b/>
+        </w:rPr>
+        <w:t>73 kW</w:t>
+      </w:r>
+      <w:r>
+        <w:t xml:space="preserve">. You can also browse real panel models under </w:t>
+      </w:r>
+      <w:r>
+        <w:rPr>
+          <w:b/>
+        </w:rPr>
+        <w:t>PV Module Selection</w:t>
+      </w:r>
+      <w:r>
+        <w:t xml:space="preserve"> (by manufacturer or technology) — for a first run the defaults are fine.</w:t>
+      </w:r>
+    </w:p>
+    <w:p>
+      <w:pPr>
+        <w:pStyle w:val="Heading2"/>
+      </w:pPr>
+      <w:r>
+        <w:t>5. Configure the generators</w:t>
+      </w:r>
+    </w:p>
+    <w:p>
+      <w:r>
+        <w:t xml:space="preserve">Still on the </w:t>
+      </w:r>
+      <w:r>
+        <w:rPr>
+          <w:b/>
+        </w:rPr>
+        <w:t>Generators</w:t>
+      </w:r>
+      <w:r>
+        <w:t xml:space="preserve"> page. Your </w:t>
+      </w:r>
+      <w:r>
+        <w:rPr>
+          <w:b/>
+        </w:rPr>
+        <w:t>Generator Fleet</w:t>
+      </w:r>
+      <w:r>
+        <w:t xml:space="preserve"> list is what the optimizer will schedule — it needs at least one generator, because solar alone can't cover the night.</w:t>
+      </w:r>
+    </w:p>
+    <w:p>
+      <w:r>
+        <w:t>The easy way — use a ready-made setup:</w:t>
+      </w:r>
+    </w:p>
+    <w:p>
+      <w:pPr>
+        <w:pStyle w:val="ListNumber"/>
+      </w:pPr>
+      <w:r>
+        <w:t xml:space="preserve">Look at </w:t>
+      </w:r>
+      <w:r>
+        <w:rPr>
+          <w:b/>
+        </w:rPr>
+        <w:t>Indonesian Market Presets</w:t>
+      </w:r>
+      <w:r>
+        <w:t xml:space="preserve"> (typical PLN configurations, e.g. small island or industrial microgrids) or </w:t>
+      </w:r>
+      <w:r>
+        <w:rPr>
+          <w:b/>
+        </w:rPr>
+        <w:t>Generator Templates</w:t>
+      </w:r>
+      <w:r>
+        <w:t xml:space="preserve"> (Diesel, Natural Gas, Coal, Biomass, Biogas).</w:t>
+      </w:r>
+    </w:p>
+    <w:p>
+      <w:pPr>
+        <w:pStyle w:val="ListNumber"/>
+      </w:pPr>
+      <w:r>
+        <w:t>Click one to add it to your fleet.</w:t>
+      </w:r>
+    </w:p>
+    <w:p>
+      <w:r>
+        <w:t xml:space="preserve">Or click </w:t>
+      </w:r>
+      <w:r>
+        <w:rPr>
+          <w:b/>
+        </w:rPr>
+        <w:t>Add Custom Generator</w:t>
+      </w:r>
+      <w:r>
+        <w:t xml:space="preserve"> and fill in the fields:</w:t>
+      </w:r>
+    </w:p>
+    <w:tbl>
+      <w:tblPr>
+        <w:tblStyle w:val="LightGrid-Accent1"/>
+        <w:tblW w:type="auto" w:w="0"/>
+        <w:tblLook w:firstColumn="1" w:firstRow="1" w:lastColumn="0" w:lastRow="0" w:noHBand="0" w:noVBand="1" w:val="04A0"/>
+      </w:tblPr>
+      <w:tblGrid>
+        <w:gridCol w:w="4320"/>
+        <w:gridCol w:w="4320"/>
+      </w:tblGrid>
+      <w:tr>
+        <w:tc>
+          <w:tcPr>
+            <w:tcW w:type="dxa" w:w="4320"/>
+          </w:tcPr>
+          <w:p>
+            <w:r>
+              <w:rPr>
+                <w:b/>
+              </w:rPr>
+              <w:t>Field</w:t>
+            </w:r>
+          </w:p>
+        </w:tc>
+        <w:tc>
+          <w:tcPr>
+            <w:tcW w:type="dxa" w:w="4320"/>
+          </w:tcPr>
+          <w:p>
+            <w:r>
+              <w:rPr>
+                <w:b/>
+              </w:rPr>
+              <w:t>Plain-language meaning</w:t>
+            </w:r>
+          </w:p>
+        </w:tc>
+      </w:tr>
+      <w:tr>
+        <w:tc>
+          <w:tcPr>
+            <w:tcW w:type="dxa" w:w="4320"/>
+          </w:tcPr>
+          <w:p>
+            <w:r>
+              <w:rPr>
+                <w:sz w:val="20"/>
+              </w:rPr>
+              <w:t>Generator Name</w:t>
+            </w:r>
+          </w:p>
+        </w:tc>
+        <w:tc>
+          <w:tcPr>
+            <w:tcW w:type="dxa" w:w="4320"/>
+          </w:tcPr>
+          <w:p>
+            <w:r>
+              <w:rPr>
+                <w:sz w:val="20"/>
+              </w:rPr>
+              <w:t>Any label, e.g. "Gas Turbine 1"</w:t>
+            </w:r>
+          </w:p>
+        </w:tc>
+      </w:tr>
+      <w:tr>
+        <w:tc>
+          <w:tcPr>
+            <w:tcW w:type="dxa" w:w="4320"/>
+          </w:tcPr>
+          <w:p>
+            <w:r>
+              <w:rPr>
+                <w:sz w:val="20"/>
+              </w:rPr>
+              <w:t>Fuel Type</w:t>
+            </w:r>
+          </w:p>
+        </w:tc>
+        <w:tc>
+          <w:tcPr>
+            <w:tcW w:type="dxa" w:w="4320"/>
+          </w:tcPr>
+          <w:p>
+            <w:r>
+              <w:rPr>
+                <w:sz w:val="20"/>
+              </w:rPr>
+              <w:t>Diesel, natural gas, coal, biomass, biogas</w:t>
+            </w:r>
+          </w:p>
+        </w:tc>
+      </w:tr>
+      <w:tr>
+        <w:tc>
+          <w:tcPr>
+            <w:tcW w:type="dxa" w:w="4320"/>
+          </w:tcPr>
+          <w:p>
+            <w:r>
+              <w:rPr>
+                <w:sz w:val="20"/>
+              </w:rPr>
+              <w:t>Min / Max Output (kW)</w:t>
+            </w:r>
+          </w:p>
+        </w:tc>
+        <w:tc>
+          <w:tcPr>
+            <w:tcW w:type="dxa" w:w="4320"/>
+          </w:tcPr>
+          <w:p>
+            <w:r>
+              <w:rPr>
+                <w:sz w:val="20"/>
+              </w:rPr>
+              <w:t>The range it can run at while on</w:t>
+            </w:r>
+          </w:p>
+        </w:tc>
+      </w:tr>
+      <w:tr>
+        <w:tc>
+          <w:tcPr>
+            <w:tcW w:type="dxa" w:w="4320"/>
+          </w:tcPr>
+          <w:p>
+            <w:r>
+              <w:rPr>
+                <w:sz w:val="20"/>
+              </w:rPr>
+              <w:t>Ramp Rate</w:t>
+            </w:r>
+          </w:p>
+        </w:tc>
+        <w:tc>
+          <w:tcPr>
+            <w:tcW w:type="dxa" w:w="4320"/>
+          </w:tcPr>
+          <w:p>
+            <w:r>
+              <w:rPr>
+                <w:sz w:val="20"/>
+              </w:rPr>
+              <w:t>How fast it can change output per hour</w:t>
+            </w:r>
+          </w:p>
+        </w:tc>
+      </w:tr>
+      <w:tr>
+        <w:tc>
+          <w:tcPr>
+            <w:tcW w:type="dxa" w:w="4320"/>
+          </w:tcPr>
+          <w:p>
+            <w:r>
+              <w:rPr>
+                <w:sz w:val="20"/>
+              </w:rPr>
+              <w:t>Fuel Cost (Rp/kWh)</w:t>
+            </w:r>
+          </w:p>
+        </w:tc>
+        <w:tc>
+          <w:tcPr>
+            <w:tcW w:type="dxa" w:w="4320"/>
+          </w:tcPr>
+          <w:p>
+            <w:r>
+              <w:rPr>
+                <w:sz w:val="20"/>
+              </w:rPr>
+              <w:t>What one kWh of its electricity costs</w:t>
+            </w:r>
+          </w:p>
+        </w:tc>
+      </w:tr>
+      <w:tr>
+        <w:tc>
+          <w:tcPr>
+            <w:tcW w:type="dxa" w:w="4320"/>
+          </w:tcPr>
+          <w:p>
+            <w:r>
+              <w:rPr>
+                <w:sz w:val="20"/>
+              </w:rPr>
+              <w:t>Emissions</w:t>
+            </w:r>
+          </w:p>
+        </w:tc>
+        <w:tc>
+          <w:tcPr>
+            <w:tcW w:type="dxa" w:w="4320"/>
+          </w:tcPr>
+          <w:p>
+            <w:r>
+              <w:rPr>
+                <w:sz w:val="20"/>
+              </w:rPr>
+              <w:t>CO2 per kWh, used for the emissions total</w:t>
+            </w:r>
+          </w:p>
+        </w:tc>
+      </w:tr>
+    </w:tbl>
+    <w:p/>
+    <w:p>
+      <w:pPr>
+        <w:shd w:val="clear" w:fill="EEF3FA"/>
+        <w:ind w:left="240"/>
+      </w:pPr>
+      <w:r>
+        <w:rPr>
+          <w:b/>
+        </w:rPr>
+        <w:t xml:space="preserve">One rule of thumb before you continue: </w:t>
+      </w:r>
+      <w:r>
+        <w:t xml:space="preserve">add up the </w:t>
+      </w:r>
+      <w:r>
+        <w:rPr>
+          <w:b/>
+        </w:rPr>
+        <w:t>Max Output</w:t>
+      </w:r>
+      <w:r>
+        <w:t xml:space="preserve"> of all your generators. It must cover your highest evening demand on its own, because the sun is down then and the battery only helps a little. For the default load (peak 170 kW), make sure your fleet totals </w:t>
+      </w:r>
+      <w:r>
+        <w:rPr>
+          <w:b/>
+        </w:rPr>
+        <w:t>at least ~180 kW</w:t>
+      </w:r>
+      <w:r>
+        <w:t xml:space="preserve"> — e.g. one gas turbine of 200 kW, or a 100 kW turbine plus an 80 kW diesel.</w:t>
+      </w:r>
+    </w:p>
+    <w:p>
+      <w:pPr>
+        <w:pStyle w:val="Heading2"/>
+      </w:pPr>
+      <w:r>
+        <w:t>6. Run the optimization and read the results</w:t>
+      </w:r>
+    </w:p>
+    <w:p>
+      <w:pPr>
+        <w:pStyle w:val="ListNumber"/>
+      </w:pPr>
+      <w:r>
+        <w:t xml:space="preserve">Open the </w:t>
+      </w:r>
+      <w:r>
+        <w:rPr>
+          <w:b/>
+        </w:rPr>
+        <w:t>Optimization</w:t>
+      </w:r>
+      <w:r>
+        <w:t xml:space="preserve"> page. Under </w:t>
+      </w:r>
+      <w:r>
+        <w:rPr>
+          <w:b/>
+        </w:rPr>
+        <w:t>System Configuration</w:t>
+      </w:r>
+      <w:r>
+        <w:t xml:space="preserve"> you'll see the location, solver (CBC MILP), and the PV/battery values you set — they carry over from the Generators page automatically.</w:t>
+      </w:r>
+    </w:p>
+    <w:p>
+      <w:pPr>
+        <w:pStyle w:val="ListNumber"/>
+      </w:pPr>
+      <w:r>
+        <w:t xml:space="preserve">Check the </w:t>
+      </w:r>
+      <w:r>
+        <w:rPr>
+          <w:b/>
+        </w:rPr>
+        <w:t>Hourly Load Editor (kW)</w:t>
+      </w:r>
+      <w:r>
+        <w:t xml:space="preserve"> — 24 bars, one per hour, showing how much electricity you need. The default profile is a typical day: low at night, a morning rise, and an evening peak. Drag or type to edit, or keep the defaults.</w:t>
+      </w:r>
+    </w:p>
+    <w:p>
+      <w:pPr>
+        <w:pStyle w:val="ListNumber"/>
+      </w:pPr>
+      <w:r>
+        <w:t xml:space="preserve">Click </w:t>
+      </w:r>
+      <w:r>
+        <w:rPr>
+          <w:b/>
+        </w:rPr>
+        <w:t>Run Optimization</w:t>
+      </w:r>
+      <w:r>
+        <w:t>.</w:t>
+      </w:r>
+    </w:p>
+    <w:p>
+      <w:r>
+        <w:t>After a moment (usually under a second) the results appear:</w:t>
+      </w:r>
+    </w:p>
+    <w:p>
+      <w:pPr>
+        <w:pStyle w:val="ListBullet"/>
+      </w:pPr>
+      <w:r>
+        <w:rPr>
+          <w:b/>
+        </w:rPr>
+        <w:t>Status: Optimal</w:t>
+      </w:r>
+      <w:r>
+        <w:t xml:space="preserve"> — this word matters. Optimal means the app found the cheapest possible plan.</w:t>
+      </w:r>
+    </w:p>
+    <w:p>
+      <w:pPr>
+        <w:pStyle w:val="ListBullet"/>
+      </w:pPr>
+      <w:r>
+        <w:rPr>
+          <w:b/>
+        </w:rPr>
+        <w:t>Total Cost</w:t>
+      </w:r>
+      <w:r>
+        <w:t xml:space="preserve"> — the full day's running cost. For the default setup expect roughly </w:t>
+      </w:r>
+      <w:r>
+        <w:rPr>
+          <w:b/>
+        </w:rPr>
+        <w:t>Rp 3–4 million</w:t>
+      </w:r>
+      <w:r>
+        <w:t>.</w:t>
+      </w:r>
+    </w:p>
+    <w:p>
+      <w:pPr>
+        <w:pStyle w:val="ListBullet"/>
+      </w:pPr>
+      <w:r>
+        <w:rPr>
+          <w:b/>
+        </w:rPr>
+        <w:t>Solve Time</w:t>
+      </w:r>
+      <w:r>
+        <w:t xml:space="preserve"> — how long the math took.</w:t>
+      </w:r>
+    </w:p>
+    <w:p>
+      <w:r>
+        <w:t>Then three charts, hour by hour:</w:t>
+      </w:r>
+    </w:p>
+    <w:p>
+      <w:pPr>
+        <w:pStyle w:val="ListBullet"/>
+      </w:pPr>
+      <w:r>
+        <w:rPr>
+          <w:b/>
+        </w:rPr>
+        <w:t>Generation Stack</w:t>
+      </w:r>
+      <w:r>
+        <w:t xml:space="preserve"> — colored bars showing which generator produces how much, each hour. You should see generators throttle down around midday (solar takes over) and ramp up for the evening peak.</w:t>
+      </w:r>
+    </w:p>
+    <w:p>
+      <w:pPr>
+        <w:pStyle w:val="ListBullet"/>
+      </w:pPr>
+      <w:r>
+        <w:rPr>
+          <w:b/>
+        </w:rPr>
+        <w:t>Solar Generation</w:t>
+      </w:r>
+      <w:r>
+        <w:t xml:space="preserve"> — the solar curve; zero at night, peak near noon.</w:t>
+      </w:r>
+    </w:p>
+    <w:p>
+      <w:pPr>
+        <w:pStyle w:val="ListBullet"/>
+      </w:pPr>
+      <w:r>
+        <w:rPr>
+          <w:b/>
+        </w:rPr>
+        <w:t>Battery Storage</w:t>
+      </w:r>
+      <w:r>
+        <w:t xml:space="preserve"> — charging (usually midday, from cheap solar) and discharging (usually evening, to shave the expensive peak).</w:t>
+      </w:r>
+    </w:p>
+    <w:p>
+      <w:r>
+        <w:rPr>
+          <w:b/>
+        </w:rPr>
+        <w:t xml:space="preserve">Reading the story in the numbers: </w:t>
+      </w:r>
+      <w:r>
+        <w:t>the optimizer uses free solar whenever it can, stores the midday surplus in the battery, releases it in the evening, and only burns fuel for what's left. That's the whole point of the platform — and you can now test "what if" scenarios: bigger battery? More solar? Cheaper fuel? Change a number and run again.</w:t>
+      </w:r>
+    </w:p>
+    <w:p>
+      <w:pPr>
+        <w:pStyle w:val="Heading3"/>
+      </w:pPr>
+      <w:r>
+        <w:t>If the status says "Infeasible"</w:t>
+      </w:r>
+    </w:p>
+    <w:p>
+      <w:r>
+        <w:rPr>
+          <w:i/>
+        </w:rPr>
+        <w:t>Infeasible</w:t>
+      </w:r>
+      <w:r>
+        <w:t xml:space="preserve"> means: with this equipment, the demand physically cannot be met in some hour — usually the evening peak. Fix it by raising a generator's </w:t>
+      </w:r>
+      <w:r>
+        <w:rPr>
+          <w:b/>
+        </w:rPr>
+        <w:t>Max Output</w:t>
+      </w:r>
+      <w:r>
+        <w:t>, adding another generator, or lowering the evening bars in the load editor. Then run again.</w:t>
+      </w:r>
+    </w:p>
+    <w:p>
+      <w:pPr>
+        <w:pStyle w:val="Heading2"/>
+      </w:pPr>
+      <w:r>
+        <w:t>7. Bonus: what would rooftop solar cost me? (Marketplace)</w:t>
+      </w:r>
+    </w:p>
+    <w:p>
+      <w:pPr>
+        <w:pStyle w:val="ListNumber"/>
+      </w:pPr>
+      <w:r>
+        <w:t xml:space="preserve">Open the </w:t>
+      </w:r>
+      <w:r>
+        <w:rPr>
+          <w:b/>
+        </w:rPr>
+        <w:t>Marketplace</w:t>
+      </w:r>
+      <w:r>
+        <w:t xml:space="preserve"> page.</w:t>
+      </w:r>
+    </w:p>
+    <w:p>
+      <w:pPr>
+        <w:pStyle w:val="ListNumber"/>
+      </w:pPr>
+      <w:r>
+        <w:t xml:space="preserve">Enter a monthly PLN electricity bill — try </w:t>
+      </w:r>
+      <w:r>
+        <w:rPr>
+          <w:b/>
+        </w:rPr>
+        <w:t>Rp 1,500,000</w:t>
+      </w:r>
+      <w:r>
+        <w:t xml:space="preserve"> with the residential tariff — and click </w:t>
+      </w:r>
+      <w:r>
+        <w:rPr>
+          <w:b/>
+        </w:rPr>
+        <w:t>Estimate</w:t>
+      </w:r>
+      <w:r>
+        <w:t>.</w:t>
+      </w:r>
+    </w:p>
+    <w:p>
+      <w:r>
+        <w:t xml:space="preserve">Expected result: a recommended system around </w:t>
+      </w:r>
+      <w:r>
+        <w:rPr>
+          <w:b/>
+        </w:rPr>
+        <w:t>4.8 kWp</w:t>
+      </w:r>
+      <w:r>
+        <w:t xml:space="preserve">, investment of about </w:t>
+      </w:r>
+      <w:r>
+        <w:rPr>
+          <w:b/>
+        </w:rPr>
+        <w:t>Rp 72 million</w:t>
+      </w:r>
+      <w:r>
+        <w:t>, the yearly savings, payback time (~ 7–8 years), and three ways to pay (cash, green loan, or a zero-upfront-cost PPA), plus matched installers and the CO2 you'd avoid.</w:t>
+      </w:r>
+    </w:p>
+    <w:p>
+      <w:pPr>
+        <w:pStyle w:val="Heading2"/>
+      </w:pPr>
+      <w:r>
+        <w:t>8. Quick fixes</w:t>
+      </w:r>
+    </w:p>
+    <w:tbl>
+      <w:tblPr>
+        <w:tblStyle w:val="LightGrid-Accent1"/>
+        <w:tblW w:type="auto" w:w="0"/>
+        <w:tblLook w:firstColumn="1" w:firstRow="1" w:lastColumn="0" w:lastRow="0" w:noHBand="0" w:noVBand="1" w:val="04A0"/>
+      </w:tblPr>
+      <w:tblGrid>
+        <w:gridCol w:w="2880"/>
+        <w:gridCol w:w="2880"/>
+        <w:gridCol w:w="2880"/>
+      </w:tblGrid>
+      <w:tr>
+        <w:tc>
+          <w:tcPr>
+            <w:tcW w:type="dxa" w:w="2880"/>
+          </w:tcPr>
+          <w:p>
+            <w:r>
+              <w:rPr>
+                <w:b/>
+              </w:rPr>
+              <w:t>What you see</w:t>
+            </w:r>
+          </w:p>
+        </w:tc>
+        <w:tc>
+          <w:tcPr>
+            <w:tcW w:type="dxa" w:w="2880"/>
+          </w:tcPr>
+          <w:p>
+            <w:r>
+              <w:rPr>
+                <w:b/>
+              </w:rPr>
+              <w:t>What it means</w:t>
+            </w:r>
+          </w:p>
+        </w:tc>
+        <w:tc>
+          <w:tcPr>
+            <w:tcW w:type="dxa" w:w="2880"/>
+          </w:tcPr>
+          <w:p>
+            <w:r>
+              <w:rPr>
+                <w:b/>
+              </w:rPr>
+              <w:t>What to do</w:t>
             </w:r>
           </w:p>
         </w:tc>
@@ -1910,7 +1487,7 @@
               <w:rPr>
                 <w:sz w:val="20"/>
               </w:rPr>
-              <w:t>Port 8000 or 3000 already in use</w:t>
+              <w:t>Every panel shows an error</w:t>
             </w:r>
           </w:p>
         </w:tc>
@@ -1923,7 +1500,7 @@
               <w:rPr>
                 <w:sz w:val="20"/>
               </w:rPr>
-              <w:t>Another process bound the port</w:t>
+              <w:t>The backend (Terminal 1) isn't running</w:t>
             </w:r>
           </w:p>
         </w:tc>
@@ -1936,7 +1513,7 @@
               <w:rPr>
                 <w:sz w:val="20"/>
               </w:rPr>
-              <w:t>uvicorn ... --port 8001 / npm run dev -- --port 3001</w:t>
+              <w:t>Start it, then refresh the browser</w:t>
             </w:r>
           </w:p>
         </w:tc>
@@ -1951,7 +1528,7 @@
               <w:rPr>
                 <w:sz w:val="20"/>
               </w:rPr>
-              <w:t>UI loads but every panel shows errors</w:t>
+              <w:t>"No generators in fleet" when you click Run</w:t>
             </w:r>
           </w:p>
         </w:tc>
@@ -1964,7 +1541,7 @@
               <w:rPr>
                 <w:sz w:val="20"/>
               </w:rPr>
-              <w:t>Backend not running</w:t>
+              <w:t>The optimizer has nothing to schedule</w:t>
             </w:r>
           </w:p>
         </w:tc>
@@ -1977,7 +1554,130 @@
               <w:rPr>
                 <w:sz w:val="20"/>
               </w:rPr>
-              <w:t>Start the backend first; the frontend proxies /api/* to :8000</w:t>
+              <w:t>Add a generator on the Generators page (step 5)</w:t>
+            </w:r>
+          </w:p>
+        </w:tc>
+      </w:tr>
+      <w:tr>
+        <w:tc>
+          <w:tcPr>
+            <w:tcW w:type="dxa" w:w="2880"/>
+          </w:tcPr>
+          <w:p>
+            <w:r>
+              <w:rPr>
+                <w:sz w:val="20"/>
+              </w:rPr>
+              <w:t>Status: Infeasible</w:t>
+            </w:r>
+          </w:p>
+        </w:tc>
+        <w:tc>
+          <w:tcPr>
+            <w:tcW w:type="dxa" w:w="2880"/>
+          </w:tcPr>
+          <w:p>
+            <w:r>
+              <w:rPr>
+                <w:sz w:val="20"/>
+              </w:rPr>
+              <w:t>Equipment can't cover the demand peak</w:t>
+            </w:r>
+          </w:p>
+        </w:tc>
+        <w:tc>
+          <w:tcPr>
+            <w:tcW w:type="dxa" w:w="2880"/>
+          </w:tcPr>
+          <w:p>
+            <w:r>
+              <w:rPr>
+                <w:sz w:val="20"/>
+              </w:rPr>
+              <w:t>See the fix box in step 6</w:t>
+            </w:r>
+          </w:p>
+        </w:tc>
+      </w:tr>
+      <w:tr>
+        <w:tc>
+          <w:tcPr>
+            <w:tcW w:type="dxa" w:w="2880"/>
+          </w:tcPr>
+          <w:p>
+            <w:r>
+              <w:rPr>
+                <w:sz w:val="20"/>
+              </w:rPr>
+              <w:t>Solar forecast is all zeros</w:t>
+            </w:r>
+          </w:p>
+        </w:tc>
+        <w:tc>
+          <w:tcPr>
+            <w:tcW w:type="dxa" w:w="2880"/>
+          </w:tcPr>
+          <w:p>
+            <w:r>
+              <w:rPr>
+                <w:sz w:val="20"/>
+              </w:rPr>
+              <w:t>Forecast window is at night</w:t>
+            </w:r>
+          </w:p>
+        </w:tc>
+        <w:tc>
+          <w:tcPr>
+            <w:tcW w:type="dxa" w:w="2880"/>
+          </w:tcPr>
+          <w:p>
+            <w:r>
+              <w:rPr>
+                <w:sz w:val="20"/>
+              </w:rPr>
+              <w:t>Use a 24 h horizon</w:t>
+            </w:r>
+          </w:p>
+        </w:tc>
+      </w:tr>
+      <w:tr>
+        <w:tc>
+          <w:tcPr>
+            <w:tcW w:type="dxa" w:w="2880"/>
+          </w:tcPr>
+          <w:p>
+            <w:r>
+              <w:rPr>
+                <w:sz w:val="20"/>
+              </w:rPr>
+              <w:t>Page won't load at :3000</w:t>
+            </w:r>
+          </w:p>
+        </w:tc>
+        <w:tc>
+          <w:tcPr>
+            <w:tcW w:type="dxa" w:w="2880"/>
+          </w:tcPr>
+          <w:p>
+            <w:r>
+              <w:rPr>
+                <w:sz w:val="20"/>
+              </w:rPr>
+              <w:t>Frontend (Terminal 2) isn't running</w:t>
+            </w:r>
+          </w:p>
+        </w:tc>
+        <w:tc>
+          <w:tcPr>
+            <w:tcW w:type="dxa" w:w="2880"/>
+          </w:tcPr>
+          <w:p>
+            <w:r>
+              <w:rPr>
+                <w:sz w:val="20"/>
+              </w:rPr>
+              <w:t>Start it and wait for the "Local:" line</w:t>
             </w:r>
           </w:p>
         </w:tc>
@@ -1989,7 +1689,7 @@
         <w:rPr>
           <w:i/>
         </w:rPr>
-        <w:t>Tested end-to-end on Linux (Fedora), Python 3.14, Node 22 — July 2026.</w:t>
+        <w:t>Tested end-to-end on Linux, Python 3.14, Node 22 — July 2026. For installation, API examples, and Docker deployment, see QUICKSTART.md.</w:t>
       </w:r>
     </w:p>
     <w:sectPr>

</xml_diff>